<commit_message>
Reformat single-page stickers to 2-up half sheet layout
All stickers now use 2-row table (5.15" each) with identical content
on both halves. No more full-page layouts.

- RIO Sticker RIO-520 - Box: was 1 row, now 2-up
- Sticker on box #1 stateline: was 1 row, now 2-up

Co-Authored-By: Claude Opus 4.6 <noreply@anthropic.com>
</commit_message>
<xml_diff>
--- a/helpful documents/Template_Library_Samples/convert for me/RIO Sticker RIO-520 - Box.docx
+++ b/helpful documents/Template_Library_Samples/convert for me/RIO Sticker RIO-520 - Box.docx
@@ -22,7 +22,7 @@
       </w:tblGrid>
       <w:tr>
         <w:trPr>
-          <w:trHeight w:val="14832" w:hRule="exact"/>
+          <w:trHeight w:val="7416" w:hRule="exact"/>
         </w:trPr>
         <w:tc>
           <w:tcPr>
@@ -82,7 +82,78 @@
             </w:pPr>
             <w:r>
               <w:rPr>
+                <w:rFonts w:ascii="Arial" w:hAnsi="Arial"/>
+                <w:b/>
+                <w:sz w:val="86"/>
+              </w:rPr>
+              <w:t>WBS: {WBS}</w:t>
+            </w:r>
+          </w:p>
+        </w:tc>
+      </w:tr>
+      <w:tr>
+        <w:trPr>
+          <w:trHeight w:val="7416" w:hRule="exact"/>
+        </w:trPr>
+        <w:tc>
+          <w:tcPr>
+            <w:tcW w:type="dxa" w:w="11088"/>
+            <w:vAlign w:val="center"/>
+            <w:tcBorders>
+              <w:top w:val="none" w:sz="0" w:space="0" w:color="auto"/>
+              <w:left w:val="none" w:sz="0" w:space="0" w:color="auto"/>
+              <w:bottom w:val="none" w:sz="0" w:space="0" w:color="auto"/>
+              <w:right w:val="none" w:sz="0" w:space="0" w:color="auto"/>
+            </w:tcBorders>
+          </w:tcPr>
+          <w:p>
+            <w:pPr>
+              <w:spacing w:before="80" w:after="80"/>
+              <w:jc w:val="center"/>
+            </w:pPr>
+            <w:r>
+              <w:rPr>
                 <w:rFonts w:ascii="Arial Black" w:hAnsi="Arial Black"/>
+                <w:b/>
+                <w:sz w:val="86"/>
+              </w:rPr>
+              <w:t>{OWNERSHIP_TEXT}</w:t>
+            </w:r>
+          </w:p>
+          <w:p>
+            <w:pPr>
+              <w:spacing w:before="80" w:after="80"/>
+              <w:jc w:val="center"/>
+            </w:pPr>
+            <w:r>
+              <w:rPr>
+                <w:rFonts w:ascii="Arial" w:hAnsi="Arial"/>
+                <w:sz w:val="84"/>
+              </w:rPr>
+              <w:t>RIO-520 (S/N = {SERIAL_NUMBER})</w:t>
+            </w:r>
+          </w:p>
+          <w:p>
+            <w:pPr>
+              <w:spacing w:before="80" w:after="80"/>
+              <w:jc w:val="center"/>
+            </w:pPr>
+            <w:r>
+              <w:rPr>
+                <w:rFonts w:ascii="Arial" w:hAnsi="Arial"/>
+                <w:sz w:val="76"/>
+              </w:rPr>
+              <w:t>{FACILITY_NAME}</w:t>
+            </w:r>
+          </w:p>
+          <w:p>
+            <w:pPr>
+              <w:spacing w:before="80" w:after="80"/>
+              <w:jc w:val="center"/>
+            </w:pPr>
+            <w:r>
+              <w:rPr>
+                <w:rFonts w:ascii="Arial" w:hAnsi="Arial"/>
                 <w:b/>
                 <w:sz w:val="86"/>
               </w:rPr>

</xml_diff>